<commit_message>
Week 6: domain model workbook (AI OFF)
</commit_message>
<xml_diff>
--- a/week6/Stage_3_SmartCare_v03_Domain_Model_Workbook.docx
+++ b/week6/Stage_3_SmartCare_v03_Domain_Model_Workbook.docx
@@ -1,6 +1,6 @@
 
 <file path=word/document.xml><?xml version="1.0" encoding="utf-8"?>
-<w:document xmlns:wpc="http://schemas.microsoft.com/office/word/2010/wordprocessingCanvas" xmlns:cx="http://schemas.microsoft.com/office/drawing/2014/chartex" xmlns:cx1="http://schemas.microsoft.com/office/drawing/2015/9/8/chartex" xmlns:cx2="http://schemas.microsoft.com/office/drawing/2015/10/21/chartex" xmlns:cx3="http://schemas.microsoft.com/office/drawing/2016/5/9/chartex" xmlns:cx4="http://schemas.microsoft.com/office/drawing/2016/5/10/chartex" xmlns:cx5="http://schemas.microsoft.com/office/drawing/2016/5/11/chartex" xmlns:cx6="http://schemas.microsoft.com/office/drawing/2016/5/12/chartex" xmlns:cx7="http://schemas.microsoft.com/office/drawing/2016/5/13/chartex" xmlns:cx8="http://schemas.microsoft.com/office/drawing/2016/5/14/chartex" xmlns:mc="http://schemas.openxmlformats.org/markup-compatibility/2006" xmlns:aink="http://schemas.microsoft.com/office/drawing/2016/ink" xmlns:am3d="http://schemas.microsoft.com/office/drawing/2017/model3d" xmlns:o="urn:schemas-microsoft-com:office:office" xmlns:oel="http://schemas.microsoft.com/office/2019/extlst" xmlns:r="http://schemas.openxmlformats.org/officeDocument/2006/relationships" xmlns:m="http://schemas.openxmlformats.org/officeDocument/2006/math" xmlns:v="urn:schemas-microsoft-com:vml" xmlns:wp14="http://schemas.microsoft.com/office/word/2010/wordprocessingDrawing" xmlns:wp="http://schemas.openxmlformats.org/drawingml/2006/wordprocessingDrawing" xmlns:w10="urn:schemas-microsoft-com:office:word" xmlns:w="http://schemas.openxmlformats.org/wordprocessingml/2006/main" xmlns:w14="http://schemas.microsoft.com/office/word/2010/wordml" xmlns:w15="http://schemas.microsoft.com/office/word/2012/wordml" xmlns:w16cei="http://schemas.microsoft.com/office/word/2026/wordml/cei" xmlns:w16cex="http://schemas.microsoft.com/office/word/2018/wordml/cex" xmlns:w16cid="http://schemas.microsoft.com/office/word/2016/wordml/cid" xmlns:w16="http://schemas.microsoft.com/office/word/2018/wordml" xmlns:w16du="http://schemas.microsoft.com/office/word/2023/wordml/word16du" xmlns:w16sdtdh="http://schemas.microsoft.com/office/word/2020/wordml/sdtdatahash" xmlns:w16sdtfl="http://schemas.microsoft.com/office/word/2024/wordml/sdtformatlock" xmlns:w16se="http://schemas.microsoft.com/office/word/2015/wordml/symex" xmlns:wpg="http://schemas.microsoft.com/office/word/2010/wordprocessingGroup" xmlns:wpi="http://schemas.microsoft.com/office/word/2010/wordprocessingInk" xmlns:wne="http://schemas.microsoft.com/office/word/2006/wordml" xmlns:wps="http://schemas.microsoft.com/office/word/2010/wordprocessingShape" mc:Ignorable="w14 w15 w16se w16cid w16 w16cex w16sdtdh w16sdtfl w16du wp14">
+<w:document xmlns:wpc="http://schemas.microsoft.com/office/word/2010/wordprocessingCanvas" xmlns:cx="http://schemas.microsoft.com/office/drawing/2014/chartex" xmlns:cx1="http://schemas.microsoft.com/office/drawing/2015/9/8/chartex" xmlns:cx2="http://schemas.microsoft.com/office/drawing/2015/10/21/chartex" xmlns:cx3="http://schemas.microsoft.com/office/drawing/2016/5/9/chartex" xmlns:cx4="http://schemas.microsoft.com/office/drawing/2016/5/10/chartex" xmlns:cx5="http://schemas.microsoft.com/office/drawing/2016/5/11/chartex" xmlns:cx6="http://schemas.microsoft.com/office/drawing/2016/5/12/chartex" xmlns:cx7="http://schemas.microsoft.com/office/drawing/2016/5/13/chartex" xmlns:cx8="http://schemas.microsoft.com/office/drawing/2016/5/14/chartex" xmlns:mc="http://schemas.openxmlformats.org/markup-compatibility/2006" xmlns:aink="http://schemas.microsoft.com/office/drawing/2016/ink" xmlns:am3d="http://schemas.microsoft.com/office/drawing/2017/model3d" xmlns:o="urn:schemas-microsoft-com:office:office" xmlns:oel="http://schemas.microsoft.com/office/2019/extlst" xmlns:r="http://schemas.openxmlformats.org/officeDocument/2006/relationships" xmlns:m="http://schemas.openxmlformats.org/officeDocument/2006/math" xmlns:v="urn:schemas-microsoft-com:vml" xmlns:wp14="http://schemas.microsoft.com/office/word/2010/wordprocessingDrawing" xmlns:wp="http://schemas.openxmlformats.org/drawingml/2006/wordprocessingDrawing" xmlns:w10="urn:schemas-microsoft-com:office:word" xmlns:w="http://schemas.openxmlformats.org/wordprocessingml/2006/main" xmlns:w14="http://schemas.microsoft.com/office/word/2010/wordml" xmlns:w15="http://schemas.microsoft.com/office/word/2012/wordml" xmlns:w16cex="http://schemas.microsoft.com/office/word/2018/wordml/cex" xmlns:w16cid="http://schemas.microsoft.com/office/word/2016/wordml/cid" xmlns:w16="http://schemas.microsoft.com/office/word/2018/wordml" xmlns:w16du="http://schemas.microsoft.com/office/word/2023/wordml/word16du" xmlns:w16sdtdh="http://schemas.microsoft.com/office/word/2020/wordml/sdtdatahash" xmlns:w16sdtfl="http://schemas.microsoft.com/office/word/2024/wordml/sdtformatlock" xmlns:w16se="http://schemas.microsoft.com/office/word/2015/wordml/symex" xmlns:wpg="http://schemas.microsoft.com/office/word/2010/wordprocessingGroup" xmlns:wpi="http://schemas.microsoft.com/office/word/2010/wordprocessingInk" xmlns:wne="http://schemas.microsoft.com/office/word/2006/wordml" xmlns:wps="http://schemas.microsoft.com/office/word/2010/wordprocessingShape" mc:Ignorable="w14 w15 w16se w16cid w16 w16cex w16sdtdh w16sdtfl w16du wp14">
   <w:body>
     <w:p>
       <w:pPr>
@@ -9,6 +9,11 @@
       </w:pPr>
       <w:r>
         <w:t>SmartCare v0.3 - Domain Model Workbook</w:t>
+      </w:r>
+    </w:p>
+    <w:p>
+      <w:r>
+        <w:t>Name: Md Mainur Hasan Rubai   Student ID: u3313159</w:t>
       </w:r>
     </w:p>
     <w:p>
@@ -72,7 +77,10 @@
           </w:tcPr>
           <w:p>
             <w:r>
-              <w:t>State/behaviour</w:t>
+              <w:t>State/</w:t>
+            </w:r>
+            <w:r>
+              <w:t>behavior</w:t>
             </w:r>
           </w:p>
         </w:tc>
@@ -92,25 +100,41 @@
           <w:tcPr>
             <w:tcW w:w="2520" w:type="dxa"/>
           </w:tcPr>
-          <w:p/>
+          <w:p>
+            <w:r>
+              <w:t>FR-01 Book appointment</w:t>
+            </w:r>
+          </w:p>
         </w:tc>
         <w:tc>
           <w:tcPr>
             <w:tcW w:w="2520" w:type="dxa"/>
           </w:tcPr>
-          <w:p/>
+          <w:p>
+            <w:r>
+              <w:t>Appointment</w:t>
+            </w:r>
+          </w:p>
         </w:tc>
         <w:tc>
           <w:tcPr>
             <w:tcW w:w="2520" w:type="dxa"/>
           </w:tcPr>
-          <w:p/>
+          <w:p>
+            <w:r>
+              <w:t>State: patient, practitioner, date, time</w:t>
+            </w:r>
+          </w:p>
         </w:tc>
         <w:tc>
           <w:tcPr>
             <w:tcW w:w="2520" w:type="dxa"/>
           </w:tcPr>
-          <w:p/>
+          <w:p>
+            <w:r>
+              <w:t>Class that links a Patient and a Practitioner; created when booked</w:t>
+            </w:r>
+          </w:p>
         </w:tc>
       </w:tr>
       <w:tr>
@@ -118,25 +142,44 @@
           <w:tcPr>
             <w:tcW w:w="2520" w:type="dxa"/>
           </w:tcPr>
-          <w:p/>
+          <w:p>
+            <w:r>
+              <w:t>FR-02 Cancel appointment</w:t>
+            </w:r>
+          </w:p>
         </w:tc>
         <w:tc>
           <w:tcPr>
             <w:tcW w:w="2520" w:type="dxa"/>
           </w:tcPr>
-          <w:p/>
+          <w:p>
+            <w:r>
+              <w:t>Appointment</w:t>
+            </w:r>
+          </w:p>
         </w:tc>
         <w:tc>
           <w:tcPr>
             <w:tcW w:w="2520" w:type="dxa"/>
           </w:tcPr>
-          <w:p/>
+          <w:p>
+            <w:r>
+              <w:t>Behavior</w:t>
+            </w:r>
+            <w:r>
+              <w:t>: cancel</w:t>
+            </w:r>
+          </w:p>
         </w:tc>
         <w:tc>
           <w:tcPr>
             <w:tcW w:w="2520" w:type="dxa"/>
           </w:tcPr>
-          <w:p/>
+          <w:p>
+            <w:r>
+              <w:t>Method that changes the status to Cancelled</w:t>
+            </w:r>
+          </w:p>
         </w:tc>
       </w:tr>
       <w:tr>
@@ -144,25 +187,49 @@
           <w:tcPr>
             <w:tcW w:w="2520" w:type="dxa"/>
           </w:tcPr>
-          <w:p/>
+          <w:p>
+            <w:r>
+              <w:t>FR-03 Block double booking</w:t>
+            </w:r>
+          </w:p>
         </w:tc>
         <w:tc>
           <w:tcPr>
             <w:tcW w:w="2520" w:type="dxa"/>
           </w:tcPr>
-          <w:p/>
+          <w:p>
+            <w:proofErr w:type="spellStart"/>
+            <w:r>
+              <w:t>Appointment</w:t>
+            </w:r>
+            <w:r>
+              <w:t>Manager</w:t>
+            </w:r>
+            <w:proofErr w:type="spellEnd"/>
+          </w:p>
         </w:tc>
         <w:tc>
           <w:tcPr>
             <w:tcW w:w="2520" w:type="dxa"/>
           </w:tcPr>
-          <w:p/>
+          <w:p>
+            <w:r>
+              <w:t>Behavior</w:t>
+            </w:r>
+            <w:r>
+              <w:t>: check for clashes before booking</w:t>
+            </w:r>
+          </w:p>
         </w:tc>
         <w:tc>
           <w:tcPr>
             <w:tcW w:w="2520" w:type="dxa"/>
           </w:tcPr>
-          <w:p/>
+          <w:p>
+            <w:r>
+              <w:t>Needs all appointments to compare, so it goes in the manager, not one Appointment</w:t>
+            </w:r>
+          </w:p>
         </w:tc>
       </w:tr>
       <w:tr>
@@ -170,25 +237,41 @@
           <w:tcPr>
             <w:tcW w:w="2520" w:type="dxa"/>
           </w:tcPr>
-          <w:p/>
+          <w:p>
+            <w:r>
+              <w:t>FR-04 Status: Booked / Cancelled / Completed</w:t>
+            </w:r>
+          </w:p>
         </w:tc>
         <w:tc>
           <w:tcPr>
             <w:tcW w:w="2520" w:type="dxa"/>
           </w:tcPr>
-          <w:p/>
+          <w:p>
+            <w:r>
+              <w:t>Appointment</w:t>
+            </w:r>
+          </w:p>
         </w:tc>
         <w:tc>
           <w:tcPr>
             <w:tcW w:w="2520" w:type="dxa"/>
           </w:tcPr>
-          <w:p/>
+          <w:p>
+            <w:r>
+              <w:t>State: status</w:t>
+            </w:r>
+          </w:p>
         </w:tc>
         <w:tc>
           <w:tcPr>
             <w:tcW w:w="2520" w:type="dxa"/>
           </w:tcPr>
-          <w:p/>
+          <w:p>
+            <w:r>
+              <w:t>Attribute on Appointment, not its own class</w:t>
+            </w:r>
+          </w:p>
         </w:tc>
       </w:tr>
       <w:tr>
@@ -196,25 +279,41 @@
           <w:tcPr>
             <w:tcW w:w="2520" w:type="dxa"/>
           </w:tcPr>
-          <w:p/>
+          <w:p>
+            <w:r>
+              <w:t>FR-05 Keep cancelled appointments in history</w:t>
+            </w:r>
+          </w:p>
         </w:tc>
         <w:tc>
           <w:tcPr>
             <w:tcW w:w="2520" w:type="dxa"/>
           </w:tcPr>
-          <w:p/>
+          <w:p>
+            <w:r>
+              <w:t>Appointment</w:t>
+            </w:r>
+          </w:p>
         </w:tc>
         <w:tc>
           <w:tcPr>
             <w:tcW w:w="2520" w:type="dxa"/>
           </w:tcPr>
-          <w:p/>
+          <w:p>
+            <w:r>
+              <w:t>State: status stays Cancelled</w:t>
+            </w:r>
+          </w:p>
         </w:tc>
         <w:tc>
           <w:tcPr>
             <w:tcW w:w="2520" w:type="dxa"/>
           </w:tcPr>
-          <w:p/>
+          <w:p>
+            <w:r>
+              <w:t>Don't delete cancelled appointments, just change their status</w:t>
+            </w:r>
+          </w:p>
         </w:tc>
       </w:tr>
       <w:tr>
@@ -222,25 +321,41 @@
           <w:tcPr>
             <w:tcW w:w="2520" w:type="dxa"/>
           </w:tcPr>
-          <w:p/>
+          <w:p>
+            <w:r>
+              <w:t>FR-06 Add patient</w:t>
+            </w:r>
+          </w:p>
         </w:tc>
         <w:tc>
           <w:tcPr>
             <w:tcW w:w="2520" w:type="dxa"/>
           </w:tcPr>
-          <w:p/>
+          <w:p>
+            <w:r>
+              <w:t>Patient</w:t>
+            </w:r>
+          </w:p>
         </w:tc>
         <w:tc>
           <w:tcPr>
             <w:tcW w:w="2520" w:type="dxa"/>
           </w:tcPr>
-          <w:p/>
+          <w:p>
+            <w:r>
+              <w:t>State: id, name, DOB, phone, address</w:t>
+            </w:r>
+          </w:p>
         </w:tc>
         <w:tc>
           <w:tcPr>
             <w:tcW w:w="2520" w:type="dxa"/>
           </w:tcPr>
-          <w:p/>
+          <w:p>
+            <w:r>
+              <w:t>Class with attributes; created by the constructor</w:t>
+            </w:r>
+          </w:p>
         </w:tc>
       </w:tr>
       <w:tr>
@@ -248,25 +363,47 @@
           <w:tcPr>
             <w:tcW w:w="2520" w:type="dxa"/>
           </w:tcPr>
-          <w:p/>
+          <w:p>
+            <w:r>
+              <w:t>FR-07 Update patient phone/address</w:t>
+            </w:r>
+          </w:p>
         </w:tc>
         <w:tc>
           <w:tcPr>
             <w:tcW w:w="2520" w:type="dxa"/>
           </w:tcPr>
-          <w:p/>
+          <w:p>
+            <w:r>
+              <w:t>Patient</w:t>
+            </w:r>
+          </w:p>
         </w:tc>
         <w:tc>
           <w:tcPr>
             <w:tcW w:w="2520" w:type="dxa"/>
           </w:tcPr>
-          <w:p/>
+          <w:p>
+            <w:r>
+              <w:t>Behavior</w:t>
+            </w:r>
+            <w:r>
+              <w:t xml:space="preserve">: </w:t>
+            </w:r>
+            <w:r>
+              <w:t>update contact</w:t>
+            </w:r>
+          </w:p>
         </w:tc>
         <w:tc>
           <w:tcPr>
             <w:tcW w:w="2520" w:type="dxa"/>
           </w:tcPr>
-          <w:p/>
+          <w:p>
+            <w:r>
+              <w:t>Method that changes phone and address</w:t>
+            </w:r>
+          </w:p>
         </w:tc>
       </w:tr>
       <w:tr>
@@ -274,25 +411,50 @@
           <w:tcPr>
             <w:tcW w:w="2520" w:type="dxa"/>
           </w:tcPr>
-          <w:p/>
+          <w:p>
+            <w:r>
+              <w:t>FR-08 Find patient by ID or name</w:t>
+            </w:r>
+          </w:p>
         </w:tc>
         <w:tc>
           <w:tcPr>
             <w:tcW w:w="2520" w:type="dxa"/>
           </w:tcPr>
-          <w:p/>
+          <w:p>
+            <w:r>
+              <w:t>Patient list</w:t>
+            </w:r>
+            <w:r>
+              <w:t xml:space="preserve"> </w:t>
+            </w:r>
+            <w:r>
+              <w:t>(not a class)</w:t>
+            </w:r>
+          </w:p>
         </w:tc>
         <w:tc>
           <w:tcPr>
             <w:tcW w:w="2520" w:type="dxa"/>
           </w:tcPr>
-          <w:p/>
+          <w:p>
+            <w:r>
+              <w:t>Behavior</w:t>
+            </w:r>
+            <w:r>
+              <w:t>: search by ID or name</w:t>
+            </w:r>
+          </w:p>
         </w:tc>
         <w:tc>
           <w:tcPr>
             <w:tcW w:w="2520" w:type="dxa"/>
           </w:tcPr>
-          <w:p/>
+          <w:p>
+            <w:r>
+              <w:t>Simple function over the patient list, no manager class needed</w:t>
+            </w:r>
+          </w:p>
         </w:tc>
       </w:tr>
       <w:tr>
@@ -300,25 +462,44 @@
           <w:tcPr>
             <w:tcW w:w="2520" w:type="dxa"/>
           </w:tcPr>
-          <w:p/>
+          <w:p>
+            <w:r>
+              <w:t>FR-09 Show practitioner's appointments and free slots</w:t>
+            </w:r>
+          </w:p>
         </w:tc>
         <w:tc>
           <w:tcPr>
             <w:tcW w:w="2520" w:type="dxa"/>
           </w:tcPr>
-          <w:p/>
+          <w:p>
+            <w:r>
+              <w:t>Practitioner, Appointment</w:t>
+            </w:r>
+          </w:p>
         </w:tc>
         <w:tc>
           <w:tcPr>
             <w:tcW w:w="2520" w:type="dxa"/>
           </w:tcPr>
-          <w:p/>
+          <w:p>
+            <w:r>
+              <w:t>Behavior</w:t>
+            </w:r>
+            <w:r>
+              <w:t>: list booked and free times</w:t>
+            </w:r>
+          </w:p>
         </w:tc>
         <w:tc>
           <w:tcPr>
             <w:tcW w:w="2520" w:type="dxa"/>
           </w:tcPr>
-          <w:p/>
+          <w:p>
+            <w:r>
+              <w:t>Simple function that filters appointments by practitioner</w:t>
+            </w:r>
+          </w:p>
         </w:tc>
       </w:tr>
       <w:tr>
@@ -326,25 +507,44 @@
           <w:tcPr>
             <w:tcW w:w="2520" w:type="dxa"/>
           </w:tcPr>
-          <w:p/>
+          <w:p>
+            <w:r>
+              <w:t>FR-10 Practitioner sees own appointments</w:t>
+            </w:r>
+          </w:p>
         </w:tc>
         <w:tc>
           <w:tcPr>
             <w:tcW w:w="2520" w:type="dxa"/>
           </w:tcPr>
-          <w:p/>
+          <w:p>
+            <w:r>
+              <w:t>Practitioner</w:t>
+            </w:r>
+          </w:p>
         </w:tc>
         <w:tc>
           <w:tcPr>
             <w:tcW w:w="2520" w:type="dxa"/>
           </w:tcPr>
-          <w:p/>
+          <w:p>
+            <w:r>
+              <w:t>Behavior</w:t>
+            </w:r>
+            <w:r>
+              <w:t>: view own appointments</w:t>
+            </w:r>
+          </w:p>
         </w:tc>
         <w:tc>
           <w:tcPr>
             <w:tcW w:w="2520" w:type="dxa"/>
           </w:tcPr>
-          <w:p/>
+          <w:p>
+            <w:r>
+              <w:t>Filter appointments by the practitioner's id</w:t>
+            </w:r>
+          </w:p>
         </w:tc>
       </w:tr>
     </w:tbl>
@@ -401,13 +601,21 @@
           <w:tcPr>
             <w:tcW w:w="5040" w:type="dxa"/>
           </w:tcPr>
-          <w:p/>
+          <w:p>
+            <w:r>
+              <w:t>Knows its own id, name, date of birth, phone and address (FR-06)</w:t>
+            </w:r>
+          </w:p>
         </w:tc>
         <w:tc>
           <w:tcPr>
             <w:tcW w:w="5040" w:type="dxa"/>
           </w:tcPr>
-          <w:p/>
+          <w:p>
+            <w:r>
+              <w:t>Appointment</w:t>
+            </w:r>
+          </w:p>
         </w:tc>
       </w:tr>
       <w:tr>
@@ -415,13 +623,21 @@
           <w:tcPr>
             <w:tcW w:w="5040" w:type="dxa"/>
           </w:tcPr>
-          <w:p/>
+          <w:p>
+            <w:r>
+              <w:t>Can update its phone and address (FR-07)</w:t>
+            </w:r>
+          </w:p>
         </w:tc>
         <w:tc>
           <w:tcPr>
             <w:tcW w:w="5040" w:type="dxa"/>
           </w:tcPr>
-          <w:p/>
+          <w:p>
+            <w:r>
+              <w:t>-</w:t>
+            </w:r>
+          </w:p>
         </w:tc>
       </w:tr>
     </w:tbl>
@@ -470,13 +686,22 @@
           <w:tcPr>
             <w:tcW w:w="5040" w:type="dxa"/>
           </w:tcPr>
-          <w:p/>
+          <w:p>
+            <w:r>
+              <w:lastRenderedPageBreak/>
+              <w:t>Knows its own id and name (FR-11).</w:t>
+            </w:r>
+          </w:p>
         </w:tc>
         <w:tc>
           <w:tcPr>
             <w:tcW w:w="5040" w:type="dxa"/>
           </w:tcPr>
-          <w:p/>
+          <w:p>
+            <w:r>
+              <w:t>Appointment</w:t>
+            </w:r>
+          </w:p>
         </w:tc>
       </w:tr>
       <w:tr>
@@ -484,13 +709,21 @@
           <w:tcPr>
             <w:tcW w:w="5040" w:type="dxa"/>
           </w:tcPr>
-          <w:p/>
+          <w:p>
+            <w:r>
+              <w:t>Can see its own appointments (FR-10).</w:t>
+            </w:r>
+          </w:p>
         </w:tc>
         <w:tc>
           <w:tcPr>
             <w:tcW w:w="5040" w:type="dxa"/>
           </w:tcPr>
-          <w:p/>
+          <w:p>
+            <w:r>
+              <w:t>Appointment</w:t>
+            </w:r>
+          </w:p>
         </w:tc>
       </w:tr>
     </w:tbl>
@@ -539,13 +772,21 @@
           <w:tcPr>
             <w:tcW w:w="5040" w:type="dxa"/>
           </w:tcPr>
-          <w:p/>
+          <w:p>
+            <w:r>
+              <w:t>Knows its patient, practitioner, date, time and status (FR-01, FR-04).</w:t>
+            </w:r>
+          </w:p>
         </w:tc>
         <w:tc>
           <w:tcPr>
             <w:tcW w:w="5040" w:type="dxa"/>
           </w:tcPr>
-          <w:p/>
+          <w:p>
+            <w:r>
+              <w:t>Patient, Practitioner</w:t>
+            </w:r>
+          </w:p>
         </w:tc>
       </w:tr>
       <w:tr>
@@ -553,13 +794,21 @@
           <w:tcPr>
             <w:tcW w:w="5040" w:type="dxa"/>
           </w:tcPr>
-          <w:p/>
+          <w:p>
+            <w:r>
+              <w:t>Can be cancelled and have its status changed, keeping cancelled ones in history (FR-02, FR-04, FR-05).</w:t>
+            </w:r>
+          </w:p>
         </w:tc>
         <w:tc>
           <w:tcPr>
             <w:tcW w:w="5040" w:type="dxa"/>
           </w:tcPr>
-          <w:p/>
+          <w:p>
+            <w:r>
+              <w:t>Patient, Practitioner</w:t>
+            </w:r>
+          </w:p>
         </w:tc>
       </w:tr>
     </w:tbl>
@@ -570,6 +819,22 @@
       <w:r>
         <w:t>Optional class</w:t>
       </w:r>
+      <w:r>
+        <w:rPr>
+          <w:rFonts w:ascii="Aptos" w:eastAsiaTheme="minorEastAsia" w:hAnsi="Aptos" w:cstheme="minorBidi"/>
+          <w:b w:val="0"/>
+          <w:bCs w:val="0"/>
+          <w:color w:val="auto"/>
+          <w:sz w:val="21"/>
+          <w:szCs w:val="22"/>
+        </w:rPr>
+        <w:t xml:space="preserve">: </w:t>
+      </w:r>
+      <w:proofErr w:type="spellStart"/>
+      <w:r>
+        <w:t>AppointmentManager</w:t>
+      </w:r>
+      <w:proofErr w:type="spellEnd"/>
     </w:p>
     <w:tbl>
       <w:tblPr>
@@ -608,13 +873,21 @@
           <w:tcPr>
             <w:tcW w:w="5040" w:type="dxa"/>
           </w:tcPr>
-          <w:p/>
+          <w:p>
+            <w:r>
+              <w:t>Holds all appointments so they can be compared (FR-01, FR-05).</w:t>
+            </w:r>
+          </w:p>
         </w:tc>
         <w:tc>
           <w:tcPr>
             <w:tcW w:w="5040" w:type="dxa"/>
           </w:tcPr>
-          <w:p/>
+          <w:p>
+            <w:r>
+              <w:t>Appointment</w:t>
+            </w:r>
+          </w:p>
         </w:tc>
       </w:tr>
       <w:tr>
@@ -622,13 +895,35 @@
           <w:tcPr>
             <w:tcW w:w="5040" w:type="dxa"/>
           </w:tcPr>
-          <w:p/>
+          <w:p>
+            <w:r>
+              <w:t xml:space="preserve">Checks for double bookings before </w:t>
+            </w:r>
+            <w:r>
+              <w:t>booking and</w:t>
+            </w:r>
+            <w:r>
+              <w:t xml:space="preserve"> </w:t>
+            </w:r>
+            <w:proofErr w:type="gramStart"/>
+            <w:r>
+              <w:t>shows</w:t>
+            </w:r>
+            <w:proofErr w:type="gramEnd"/>
+            <w:r>
+              <w:t xml:space="preserve"> a practitioner's appointments and free slots (FR-03, FR-09).</w:t>
+            </w:r>
+          </w:p>
         </w:tc>
         <w:tc>
           <w:tcPr>
             <w:tcW w:w="5040" w:type="dxa"/>
           </w:tcPr>
-          <w:p/>
+          <w:p>
+            <w:r>
+              <w:t>Appointment, Practitioner</w:t>
+            </w:r>
+          </w:p>
         </w:tc>
       </w:tr>
     </w:tbl>
@@ -637,12 +932,53 @@
         <w:pStyle w:val="Heading1"/>
       </w:pPr>
       <w:r>
+        <w:lastRenderedPageBreak/>
         <w:t>UML Class Diagram</w:t>
       </w:r>
     </w:p>
     <w:p>
+      <w:pPr>
+        <w:pStyle w:val="Heading1"/>
+      </w:pPr>
       <w:r>
-        <w:t>Insert/draw UML here. Include defensible relationships and multiplicities.</w:t>
+        <w:rPr>
+          <w:noProof/>
+        </w:rPr>
+        <w:drawing>
+          <wp:inline distT="0" distB="0" distL="0" distR="0" wp14:anchorId="515F3989" wp14:editId="5C3C431A">
+            <wp:extent cx="6505575" cy="4832350"/>
+            <wp:effectExtent l="0" t="0" r="9525" b="6350"/>
+            <wp:docPr id="1873663321" name="Picture 1"/>
+            <wp:cNvGraphicFramePr>
+              <a:graphicFrameLocks xmlns:a="http://schemas.openxmlformats.org/drawingml/2006/main" noChangeAspect="1"/>
+            </wp:cNvGraphicFramePr>
+            <a:graphic xmlns:a="http://schemas.openxmlformats.org/drawingml/2006/main">
+              <a:graphicData uri="http://schemas.openxmlformats.org/drawingml/2006/picture">
+                <pic:pic xmlns:pic="http://schemas.openxmlformats.org/drawingml/2006/picture">
+                  <pic:nvPicPr>
+                    <pic:cNvPr id="1873663321" name="Picture 1873663321"/>
+                    <pic:cNvPicPr/>
+                  </pic:nvPicPr>
+                  <pic:blipFill>
+                    <a:blip r:embed="rId6"/>
+                    <a:stretch>
+                      <a:fillRect/>
+                    </a:stretch>
+                  </pic:blipFill>
+                  <pic:spPr>
+                    <a:xfrm>
+                      <a:off x="0" y="0"/>
+                      <a:ext cx="6512188" cy="4837262"/>
+                    </a:xfrm>
+                    <a:prstGeom prst="rect">
+                      <a:avLst/>
+                    </a:prstGeom>
+                  </pic:spPr>
+                </pic:pic>
+              </a:graphicData>
+            </a:graphic>
+          </wp:inline>
+        </w:drawing>
       </w:r>
     </w:p>
     <w:p>
@@ -654,16 +990,305 @@
       </w:r>
     </w:p>
     <w:p>
+      <w:pPr>
+        <w:rPr>
+          <w:lang w:val="en-AU"/>
+        </w:rPr>
+      </w:pPr>
       <w:r>
-        <w:t>Explain class selection, responsibility allocation and key relationships.</w:t>
+        <w:t xml:space="preserve">Explain </w:t>
+      </w:r>
+      <w:r>
+        <w:rPr>
+          <w:b/>
+          <w:bCs/>
+          <w:lang w:val="en-AU"/>
+        </w:rPr>
+        <w:t>Class Selection</w:t>
+      </w:r>
+      <w:r>
+        <w:rPr>
+          <w:lang w:val="en-AU"/>
+        </w:rPr>
+        <w:br/>
+      </w:r>
+      <w:r>
+        <w:rPr>
+          <w:lang w:val="en-AU"/>
+        </w:rPr>
+        <w:t xml:space="preserve">We decided to go with those four main classes, Patient, </w:t>
+      </w:r>
+      <w:proofErr w:type="spellStart"/>
+      <w:r>
+        <w:rPr>
+          <w:lang w:val="en-AU"/>
+        </w:rPr>
+        <w:t>Practioner</w:t>
+      </w:r>
+      <w:proofErr w:type="spellEnd"/>
+      <w:r>
+        <w:rPr>
+          <w:lang w:val="en-AU"/>
+        </w:rPr>
+        <w:t xml:space="preserve">, Appointment and </w:t>
+      </w:r>
+      <w:proofErr w:type="spellStart"/>
+      <w:r>
+        <w:rPr>
+          <w:lang w:val="en-AU"/>
+        </w:rPr>
+        <w:t>AppointmentManager</w:t>
+      </w:r>
+      <w:proofErr w:type="spellEnd"/>
+      <w:r>
+        <w:rPr>
+          <w:lang w:val="en-AU"/>
+        </w:rPr>
+        <w:t xml:space="preserve">. They really are the core pieces needed to make the system function. We intentionally did not design separate classes for elements such as Name, Status, Clinic, Database and Cancelation. The thing is that Name and Status are just simple things or properties that belong to other things, not separate things with their own </w:t>
+      </w:r>
+      <w:proofErr w:type="spellStart"/>
+      <w:r>
+        <w:rPr>
+          <w:lang w:val="en-AU"/>
+        </w:rPr>
+        <w:t>behavior</w:t>
+      </w:r>
+      <w:proofErr w:type="spellEnd"/>
+      <w:r>
+        <w:rPr>
+          <w:lang w:val="en-AU"/>
+        </w:rPr>
+        <w:t xml:space="preserve">. The database is </w:t>
+      </w:r>
+      <w:proofErr w:type="gramStart"/>
+      <w:r>
+        <w:rPr>
+          <w:lang w:val="en-AU"/>
+        </w:rPr>
+        <w:t>really just</w:t>
+      </w:r>
+      <w:proofErr w:type="gramEnd"/>
+      <w:r>
+        <w:rPr>
+          <w:lang w:val="en-AU"/>
+        </w:rPr>
+        <w:t xml:space="preserve"> storage, an implementation detail that we don't have to model as a class. And </w:t>
+      </w:r>
+      <w:proofErr w:type="gramStart"/>
+      <w:r>
+        <w:rPr>
+          <w:lang w:val="en-AU"/>
+        </w:rPr>
+        <w:t>Cancelation ?</w:t>
+      </w:r>
+      <w:proofErr w:type="gramEnd"/>
+      <w:r>
+        <w:rPr>
+          <w:lang w:val="en-AU"/>
+        </w:rPr>
+        <w:t xml:space="preserve"> That’s just an action, something that happens to an appointment, so it makes much more sense as a method, not a class of its own.</w:t>
       </w:r>
     </w:p>
+    <w:p>
+      <w:pPr>
+        <w:rPr>
+          <w:lang w:val="en-AU"/>
+        </w:rPr>
+      </w:pPr>
+      <w:r>
+        <w:rPr>
+          <w:b/>
+          <w:bCs/>
+          <w:lang w:val="en-AU"/>
+        </w:rPr>
+        <w:t>Responsibility Allocation</w:t>
+      </w:r>
+      <w:r>
+        <w:rPr>
+          <w:lang w:val="en-AU"/>
+        </w:rPr>
+        <w:br/>
+      </w:r>
+      <w:r>
+        <w:rPr>
+          <w:lang w:val="en-AU"/>
+        </w:rPr>
+        <w:t xml:space="preserve">We put </w:t>
+      </w:r>
+      <w:proofErr w:type="spellStart"/>
+      <w:r>
+        <w:rPr>
+          <w:lang w:val="en-AU"/>
+        </w:rPr>
+        <w:t>has_</w:t>
+      </w:r>
+      <w:proofErr w:type="gramStart"/>
+      <w:r>
+        <w:rPr>
+          <w:lang w:val="en-AU"/>
+        </w:rPr>
+        <w:t>clash</w:t>
+      </w:r>
+      <w:proofErr w:type="spellEnd"/>
+      <w:r>
+        <w:rPr>
+          <w:lang w:val="en-AU"/>
+        </w:rPr>
+        <w:t>(</w:t>
+      </w:r>
+      <w:proofErr w:type="gramEnd"/>
+      <w:r>
+        <w:rPr>
+          <w:lang w:val="en-AU"/>
+        </w:rPr>
+        <w:t xml:space="preserve">) inside </w:t>
+      </w:r>
+      <w:proofErr w:type="spellStart"/>
+      <w:r>
+        <w:rPr>
+          <w:lang w:val="en-AU"/>
+        </w:rPr>
+        <w:t>AppointmentManager</w:t>
+      </w:r>
+      <w:proofErr w:type="spellEnd"/>
+      <w:r>
+        <w:rPr>
+          <w:lang w:val="en-AU"/>
+        </w:rPr>
+        <w:t xml:space="preserve"> because scheduling conflict checking is a big picture problem—you need to compare one slot against everything else that’s been booked. A single Appointment simply can't see the rest of the schedule, so it has no business trying to detect clashes. </w:t>
+      </w:r>
+      <w:proofErr w:type="gramStart"/>
+      <w:r>
+        <w:rPr>
+          <w:lang w:val="en-AU"/>
+        </w:rPr>
+        <w:t>cancel(</w:t>
+      </w:r>
+      <w:proofErr w:type="gramEnd"/>
+      <w:r>
+        <w:rPr>
+          <w:lang w:val="en-AU"/>
+        </w:rPr>
+        <w:t xml:space="preserve">) belongs to Appointment itself, because </w:t>
+      </w:r>
+      <w:proofErr w:type="spellStart"/>
+      <w:r>
+        <w:rPr>
+          <w:lang w:val="en-AU"/>
+        </w:rPr>
+        <w:t>canceling</w:t>
+      </w:r>
+      <w:proofErr w:type="spellEnd"/>
+      <w:r>
+        <w:rPr>
+          <w:lang w:val="en-AU"/>
+        </w:rPr>
+        <w:t xml:space="preserve"> is </w:t>
+      </w:r>
+      <w:proofErr w:type="gramStart"/>
+      <w:r>
+        <w:rPr>
+          <w:lang w:val="en-AU"/>
+        </w:rPr>
+        <w:t>really just</w:t>
+      </w:r>
+      <w:proofErr w:type="gramEnd"/>
+      <w:r>
+        <w:rPr>
+          <w:lang w:val="en-AU"/>
+        </w:rPr>
+        <w:t xml:space="preserve"> changing that specific appointment's own state, like flipping </w:t>
+      </w:r>
+      <w:r>
+        <w:rPr>
+          <w:lang w:val="en-AU"/>
+        </w:rPr>
+        <w:lastRenderedPageBreak/>
+        <w:t xml:space="preserve">it from "Active" to "Cancelled." This is a classic case of giving the job to the person who </w:t>
+      </w:r>
+      <w:proofErr w:type="gramStart"/>
+      <w:r>
+        <w:rPr>
+          <w:lang w:val="en-AU"/>
+        </w:rPr>
+        <w:t>actually has</w:t>
+      </w:r>
+      <w:proofErr w:type="gramEnd"/>
+      <w:r>
+        <w:rPr>
+          <w:lang w:val="en-AU"/>
+        </w:rPr>
+        <w:t xml:space="preserve"> the information to do the job.</w:t>
+      </w:r>
+    </w:p>
+    <w:p>
+      <w:pPr>
+        <w:rPr>
+          <w:lang w:val="en-AU"/>
+        </w:rPr>
+      </w:pPr>
+      <w:r>
+        <w:rPr>
+          <w:b/>
+          <w:bCs/>
+          <w:lang w:val="en-AU"/>
+        </w:rPr>
+        <w:t>Key Relationships</w:t>
+      </w:r>
+      <w:r>
+        <w:rPr>
+          <w:lang w:val="en-AU"/>
+        </w:rPr>
+        <w:br/>
+      </w:r>
+      <w:r>
+        <w:rPr>
+          <w:lang w:val="en-AU"/>
+        </w:rPr>
+        <w:t>The 1-to-</w:t>
+      </w:r>
+      <w:proofErr w:type="gramStart"/>
+      <w:r>
+        <w:rPr>
+          <w:lang w:val="en-AU"/>
+        </w:rPr>
+        <w:t>0..</w:t>
+      </w:r>
+      <w:proofErr w:type="gramEnd"/>
+      <w:r>
+        <w:rPr>
+          <w:lang w:val="en-AU"/>
+        </w:rPr>
+        <w:t xml:space="preserve">* relationship between Patient/Practitioner and Appointment is just reality. A person can exist in the system with zero appointments, or they can have a whole bunch over time. We didn't use inheritance as an Appointment isn't a type of Patient or Practitioner, they are completely different things that are just connected to each other, not in the same family tree. The filled diamond means composition, i.e. the </w:t>
+      </w:r>
+      <w:proofErr w:type="spellStart"/>
+      <w:r>
+        <w:rPr>
+          <w:lang w:val="en-AU"/>
+        </w:rPr>
+        <w:t>AppointmentManager</w:t>
+      </w:r>
+      <w:proofErr w:type="spellEnd"/>
+      <w:r>
+        <w:rPr>
+          <w:lang w:val="en-AU"/>
+        </w:rPr>
+        <w:t xml:space="preserve"> really owns its Appointments and manages their lifecycle. They are not things in themselves, independent of the manager.</w:t>
+      </w:r>
+    </w:p>
+    <w:p>
+      <w:pPr>
+        <w:rPr>
+          <w:lang w:val="en-AU"/>
+        </w:rPr>
+      </w:pPr>
+    </w:p>
+    <w:p/>
     <w:p>
       <w:pPr>
         <w:pStyle w:val="Heading1"/>
       </w:pPr>
       <w:r>
-        <w:lastRenderedPageBreak/>
         <w:t>AI Design Review Record</w:t>
       </w:r>
     </w:p>
@@ -905,7 +1530,7 @@
 </file>
 
 <file path=word/numbering.xml><?xml version="1.0" encoding="utf-8"?>
-<w:numbering xmlns:wpc="http://schemas.microsoft.com/office/word/2010/wordprocessingCanvas" xmlns:cx="http://schemas.microsoft.com/office/drawing/2014/chartex" xmlns:cx1="http://schemas.microsoft.com/office/drawing/2015/9/8/chartex" xmlns:cx2="http://schemas.microsoft.com/office/drawing/2015/10/21/chartex" xmlns:cx3="http://schemas.microsoft.com/office/drawing/2016/5/9/chartex" xmlns:cx4="http://schemas.microsoft.com/office/drawing/2016/5/10/chartex" xmlns:cx5="http://schemas.microsoft.com/office/drawing/2016/5/11/chartex" xmlns:cx6="http://schemas.microsoft.com/office/drawing/2016/5/12/chartex" xmlns:cx7="http://schemas.microsoft.com/office/drawing/2016/5/13/chartex" xmlns:cx8="http://schemas.microsoft.com/office/drawing/2016/5/14/chartex" xmlns:mc="http://schemas.openxmlformats.org/markup-compatibility/2006" xmlns:aink="http://schemas.microsoft.com/office/drawing/2016/ink" xmlns:am3d="http://schemas.microsoft.com/office/drawing/2017/model3d" xmlns:o="urn:schemas-microsoft-com:office:office" xmlns:oel="http://schemas.microsoft.com/office/2019/extlst" xmlns:r="http://schemas.openxmlformats.org/officeDocument/2006/relationships" xmlns:m="http://schemas.openxmlformats.org/officeDocument/2006/math" xmlns:v="urn:schemas-microsoft-com:vml" xmlns:wp14="http://schemas.microsoft.com/office/word/2010/wordprocessingDrawing" xmlns:wp="http://schemas.openxmlformats.org/drawingml/2006/wordprocessingDrawing" xmlns:w10="urn:schemas-microsoft-com:office:word" xmlns:w="http://schemas.openxmlformats.org/wordprocessingml/2006/main" xmlns:w14="http://schemas.microsoft.com/office/word/2010/wordml" xmlns:w15="http://schemas.microsoft.com/office/word/2012/wordml" xmlns:w16cei="http://schemas.microsoft.com/office/word/2026/wordml/cei" xmlns:w16cex="http://schemas.microsoft.com/office/word/2018/wordml/cex" xmlns:w16cid="http://schemas.microsoft.com/office/word/2016/wordml/cid" xmlns:w16="http://schemas.microsoft.com/office/word/2018/wordml" xmlns:w16du="http://schemas.microsoft.com/office/word/2023/wordml/word16du" xmlns:w16sdtdh="http://schemas.microsoft.com/office/word/2020/wordml/sdtdatahash" xmlns:w16sdtfl="http://schemas.microsoft.com/office/word/2024/wordml/sdtformatlock" xmlns:w16se="http://schemas.microsoft.com/office/word/2015/wordml/symex" xmlns:wpg="http://schemas.microsoft.com/office/word/2010/wordprocessingGroup" xmlns:wpi="http://schemas.microsoft.com/office/word/2010/wordprocessingInk" xmlns:wne="http://schemas.microsoft.com/office/word/2006/wordml" xmlns:wps="http://schemas.microsoft.com/office/word/2010/wordprocessingShape" mc:Ignorable="w14 w15 w16se w16cid w16 w16cex w16sdtdh w16sdtfl w16du wp14">
+<w:numbering xmlns:wpc="http://schemas.microsoft.com/office/word/2010/wordprocessingCanvas" xmlns:cx="http://schemas.microsoft.com/office/drawing/2014/chartex" xmlns:cx1="http://schemas.microsoft.com/office/drawing/2015/9/8/chartex" xmlns:cx2="http://schemas.microsoft.com/office/drawing/2015/10/21/chartex" xmlns:cx3="http://schemas.microsoft.com/office/drawing/2016/5/9/chartex" xmlns:cx4="http://schemas.microsoft.com/office/drawing/2016/5/10/chartex" xmlns:cx5="http://schemas.microsoft.com/office/drawing/2016/5/11/chartex" xmlns:cx6="http://schemas.microsoft.com/office/drawing/2016/5/12/chartex" xmlns:cx7="http://schemas.microsoft.com/office/drawing/2016/5/13/chartex" xmlns:cx8="http://schemas.microsoft.com/office/drawing/2016/5/14/chartex" xmlns:mc="http://schemas.openxmlformats.org/markup-compatibility/2006" xmlns:aink="http://schemas.microsoft.com/office/drawing/2016/ink" xmlns:am3d="http://schemas.microsoft.com/office/drawing/2017/model3d" xmlns:o="urn:schemas-microsoft-com:office:office" xmlns:oel="http://schemas.microsoft.com/office/2019/extlst" xmlns:r="http://schemas.openxmlformats.org/officeDocument/2006/relationships" xmlns:m="http://schemas.openxmlformats.org/officeDocument/2006/math" xmlns:v="urn:schemas-microsoft-com:vml" xmlns:wp14="http://schemas.microsoft.com/office/word/2010/wordprocessingDrawing" xmlns:wp="http://schemas.openxmlformats.org/drawingml/2006/wordprocessingDrawing" xmlns:w10="urn:schemas-microsoft-com:office:word" xmlns:w="http://schemas.openxmlformats.org/wordprocessingml/2006/main" xmlns:w14="http://schemas.microsoft.com/office/word/2010/wordml" xmlns:w15="http://schemas.microsoft.com/office/word/2012/wordml" xmlns:w16cex="http://schemas.microsoft.com/office/word/2018/wordml/cex" xmlns:w16cid="http://schemas.microsoft.com/office/word/2016/wordml/cid" xmlns:w16="http://schemas.microsoft.com/office/word/2018/wordml" xmlns:w16du="http://schemas.microsoft.com/office/word/2023/wordml/word16du" xmlns:w16sdtdh="http://schemas.microsoft.com/office/word/2020/wordml/sdtdatahash" xmlns:w16sdtfl="http://schemas.microsoft.com/office/word/2024/wordml/sdtformatlock" xmlns:w16se="http://schemas.microsoft.com/office/word/2015/wordml/symex" xmlns:wpg="http://schemas.microsoft.com/office/word/2010/wordprocessingGroup" xmlns:wpi="http://schemas.microsoft.com/office/word/2010/wordprocessingInk" xmlns:wne="http://schemas.microsoft.com/office/word/2006/wordml" xmlns:wps="http://schemas.microsoft.com/office/word/2010/wordprocessingShape" mc:Ignorable="w14 w15 w16se w16cid w16 w16cex w16sdtdh w16sdtfl w16du wp14">
   <w:abstractNum w:abstractNumId="0" w15:restartNumberingAfterBreak="0">
     <w:nsid w:val="FFFFFF7C"/>
     <w:multiLevelType w:val="singleLevel"/>
@@ -1714,7 +2339,6 @@
   <w:style w:type="character" w:default="1" w:styleId="DefaultParagraphFont">
     <w:name w:val="Default Paragraph Font"/>
     <w:uiPriority w:val="1"/>
-    <w:semiHidden/>
     <w:unhideWhenUsed/>
   </w:style>
   <w:style w:type="table" w:default="1" w:styleId="TableNormal">
@@ -12490,6 +13114,19 @@
         <w:shd w:val="clear" w:color="auto" w:fill="FBCAA2" w:themeFill="accent6" w:themeFillTint="7F"/>
       </w:tcPr>
     </w:tblStylePr>
+  </w:style>
+  <w:style w:type="paragraph" w:styleId="NormalWeb">
+    <w:name w:val="Normal (Web)"/>
+    <w:basedOn w:val="Normal"/>
+    <w:uiPriority w:val="99"/>
+    <w:semiHidden/>
+    <w:unhideWhenUsed/>
+    <w:rsid w:val="001905C3"/>
+    <w:rPr>
+      <w:rFonts w:ascii="Times New Roman" w:hAnsi="Times New Roman" w:cs="Times New Roman"/>
+      <w:sz w:val="24"/>
+      <w:szCs w:val="24"/>
+    </w:rPr>
   </w:style>
 </w:styles>
 </file>

</xml_diff>

<commit_message>
Week 6: updated UML diagram after AI review
</commit_message>
<xml_diff>
--- a/week6/Stage_3_SmartCare_v03_Domain_Model_Workbook.docx
+++ b/week6/Stage_3_SmartCare_v03_Domain_Model_Workbook.docx
@@ -426,10 +426,7 @@
               <w:t>Patient list</w:t>
             </w:r>
             <w:r>
-              <w:t xml:space="preserve"> </w:t>
-            </w:r>
-            <w:r>
-              <w:t>(not a class)</w:t>
+              <w:t xml:space="preserve"> (not a class)</w:t>
             </w:r>
           </w:p>
         </w:tc>
@@ -529,10 +526,7 @@
           </w:tcPr>
           <w:p>
             <w:r>
-              <w:t>Behavior</w:t>
-            </w:r>
-            <w:r>
-              <w:t>: view own appointments</w:t>
+              <w:t>Behavior: view own appointments</w:t>
             </w:r>
           </w:p>
         </w:tc>
@@ -1299,11 +1293,11 @@
         <w:tblLook w:val="04A0" w:firstRow="1" w:lastRow="0" w:firstColumn="1" w:lastColumn="0" w:noHBand="0" w:noVBand="1"/>
       </w:tblPr>
       <w:tblGrid>
-        <w:gridCol w:w="2016"/>
-        <w:gridCol w:w="2016"/>
-        <w:gridCol w:w="2016"/>
-        <w:gridCol w:w="2016"/>
-        <w:gridCol w:w="2016"/>
+        <w:gridCol w:w="3867"/>
+        <w:gridCol w:w="1602"/>
+        <w:gridCol w:w="928"/>
+        <w:gridCol w:w="1918"/>
+        <w:gridCol w:w="1981"/>
       </w:tblGrid>
       <w:tr>
         <w:tc>
@@ -1362,31 +1356,127 @@
           <w:tcPr>
             <w:tcW w:w="2016" w:type="dxa"/>
           </w:tcPr>
-          <w:p/>
+          <w:p>
+            <w:pPr>
+              <w:rPr>
+                <w:rFonts w:asciiTheme="minorHAnsi" w:hAnsiTheme="minorHAnsi"/>
+              </w:rPr>
+            </w:pPr>
+            <w:r>
+              <w:rPr>
+                <w:rFonts w:asciiTheme="minorHAnsi" w:hAnsiTheme="minorHAnsi"/>
+              </w:rPr>
+              <w:t xml:space="preserve">Add a </w:t>
+            </w:r>
+            <w:proofErr w:type="gramStart"/>
+            <w:r>
+              <w:rPr>
+                <w:rFonts w:asciiTheme="minorHAnsi" w:hAnsiTheme="minorHAnsi"/>
+              </w:rPr>
+              <w:t>Receptionist</w:t>
+            </w:r>
+            <w:proofErr w:type="gramEnd"/>
+            <w:r>
+              <w:rPr>
+                <w:rFonts w:asciiTheme="minorHAnsi" w:hAnsiTheme="minorHAnsi"/>
+              </w:rPr>
+              <w:t xml:space="preserve"> class with operations like </w:t>
+            </w:r>
+            <w:proofErr w:type="spellStart"/>
+            <w:proofErr w:type="gramStart"/>
+            <w:r>
+              <w:rPr>
+                <w:rFonts w:asciiTheme="minorHAnsi" w:hAnsiTheme="minorHAnsi"/>
+              </w:rPr>
+              <w:t>bookAppointment</w:t>
+            </w:r>
+            <w:proofErr w:type="spellEnd"/>
+            <w:r>
+              <w:rPr>
+                <w:rFonts w:asciiTheme="minorHAnsi" w:hAnsiTheme="minorHAnsi"/>
+              </w:rPr>
+              <w:t>(</w:t>
+            </w:r>
+            <w:proofErr w:type="gramEnd"/>
+            <w:r>
+              <w:rPr>
+                <w:rFonts w:asciiTheme="minorHAnsi" w:hAnsiTheme="minorHAnsi"/>
+              </w:rPr>
+              <w:t>)</w:t>
+            </w:r>
+          </w:p>
         </w:tc>
         <w:tc>
           <w:tcPr>
             <w:tcW w:w="2016" w:type="dxa"/>
           </w:tcPr>
-          <w:p/>
+          <w:p>
+            <w:pPr>
+              <w:rPr>
+                <w:rFonts w:asciiTheme="minorHAnsi" w:hAnsiTheme="minorHAnsi"/>
+              </w:rPr>
+            </w:pPr>
+            <w:r>
+              <w:rPr>
+                <w:rFonts w:asciiTheme="minorHAnsi" w:hAnsiTheme="minorHAnsi"/>
+              </w:rPr>
+              <w:t>Copilot cited FR-01, FR-02, FR-06… but these only say a receptionist uses the system</w:t>
+            </w:r>
+          </w:p>
         </w:tc>
         <w:tc>
           <w:tcPr>
             <w:tcW w:w="2016" w:type="dxa"/>
           </w:tcPr>
-          <w:p/>
+          <w:p>
+            <w:pPr>
+              <w:rPr>
+                <w:rFonts w:asciiTheme="minorHAnsi" w:hAnsiTheme="minorHAnsi"/>
+              </w:rPr>
+            </w:pPr>
+            <w:r>
+              <w:rPr>
+                <w:rFonts w:asciiTheme="minorHAnsi" w:hAnsiTheme="minorHAnsi"/>
+              </w:rPr>
+              <w:t>Rejected</w:t>
+            </w:r>
+          </w:p>
         </w:tc>
         <w:tc>
           <w:tcPr>
             <w:tcW w:w="2016" w:type="dxa"/>
           </w:tcPr>
-          <w:p/>
+          <w:p>
+            <w:pPr>
+              <w:rPr>
+                <w:rFonts w:asciiTheme="minorHAnsi" w:hAnsiTheme="minorHAnsi"/>
+              </w:rPr>
+            </w:pPr>
+            <w:r>
+              <w:rPr>
+                <w:rFonts w:asciiTheme="minorHAnsi" w:hAnsiTheme="minorHAnsi"/>
+              </w:rPr>
+              <w:t>A receptionist is a user of the system, not something the clinic stores data about. Copilot gave it no attributes.</w:t>
+            </w:r>
+          </w:p>
         </w:tc>
         <w:tc>
           <w:tcPr>
             <w:tcW w:w="2016" w:type="dxa"/>
           </w:tcPr>
-          <w:p/>
+          <w:p>
+            <w:pPr>
+              <w:rPr>
+                <w:rFonts w:asciiTheme="minorHAnsi" w:hAnsiTheme="minorHAnsi"/>
+              </w:rPr>
+            </w:pPr>
+            <w:r>
+              <w:rPr>
+                <w:rFonts w:asciiTheme="minorHAnsi" w:hAnsiTheme="minorHAnsi"/>
+              </w:rPr>
+              <w:t>None</w:t>
+            </w:r>
+          </w:p>
         </w:tc>
       </w:tr>
       <w:tr>
@@ -1394,31 +1484,174 @@
           <w:tcPr>
             <w:tcW w:w="2016" w:type="dxa"/>
           </w:tcPr>
-          <w:p/>
+          <w:p>
+            <w:pPr>
+              <w:rPr>
+                <w:rFonts w:asciiTheme="minorHAnsi" w:hAnsiTheme="minorHAnsi"/>
+              </w:rPr>
+            </w:pPr>
+            <w:proofErr w:type="spellStart"/>
+            <w:r>
+              <w:rPr>
+                <w:rFonts w:asciiTheme="minorHAnsi" w:hAnsiTheme="minorHAnsi"/>
+              </w:rPr>
+              <w:t>AppointmentStatus</w:t>
+            </w:r>
+            <w:proofErr w:type="spellEnd"/>
+            <w:r>
+              <w:rPr>
+                <w:rFonts w:asciiTheme="minorHAnsi" w:hAnsiTheme="minorHAnsi"/>
+              </w:rPr>
+              <w:t xml:space="preserve"> enumeration</w:t>
+            </w:r>
+          </w:p>
         </w:tc>
         <w:tc>
           <w:tcPr>
             <w:tcW w:w="2016" w:type="dxa"/>
           </w:tcPr>
-          <w:p/>
+          <w:tbl>
+            <w:tblPr>
+              <w:tblW w:w="0" w:type="auto"/>
+              <w:tblCellSpacing w:w="15" w:type="dxa"/>
+              <w:tblCellMar>
+                <w:top w:w="15" w:type="dxa"/>
+                <w:left w:w="15" w:type="dxa"/>
+                <w:bottom w:w="15" w:type="dxa"/>
+                <w:right w:w="15" w:type="dxa"/>
+              </w:tblCellMar>
+              <w:tblLook w:val="04A0" w:firstRow="1" w:lastRow="0" w:firstColumn="1" w:lastColumn="0" w:noHBand="0" w:noVBand="1"/>
+            </w:tblPr>
+            <w:tblGrid>
+              <w:gridCol w:w="1305"/>
+              <w:gridCol w:w="81"/>
+            </w:tblGrid>
+            <w:tr>
+              <w:trPr>
+                <w:tblCellSpacing w:w="15" w:type="dxa"/>
+              </w:trPr>
+              <w:tc>
+                <w:tcPr>
+                  <w:tcW w:w="0" w:type="auto"/>
+                  <w:vAlign w:val="center"/>
+                  <w:hideMark/>
+                </w:tcPr>
+                <w:p>
+                  <w:pPr>
+                    <w:spacing w:after="0" w:line="240" w:lineRule="auto"/>
+                    <w:rPr>
+                      <w:rFonts w:asciiTheme="minorHAnsi" w:eastAsia="Times New Roman" w:hAnsiTheme="minorHAnsi" w:cs="Times New Roman"/>
+                      <w:sz w:val="24"/>
+                      <w:szCs w:val="24"/>
+                      <w:lang w:val="en-AU" w:eastAsia="en-AU"/>
+                    </w:rPr>
+                  </w:pPr>
+                  <w:r>
+                    <w:rPr>
+                      <w:rFonts w:asciiTheme="minorHAnsi" w:eastAsia="Times New Roman" w:hAnsiTheme="minorHAnsi" w:cs="Times New Roman"/>
+                      <w:sz w:val="24"/>
+                      <w:szCs w:val="24"/>
+                      <w:lang w:val="en-AU" w:eastAsia="en-AU"/>
+                    </w:rPr>
+                    <w:t>FR-04 lists exactly three statuses: Booked, Cancelled, Completed</w:t>
+                  </w:r>
+                </w:p>
+              </w:tc>
+              <w:tc>
+                <w:tcPr>
+                  <w:tcW w:w="0" w:type="auto"/>
+                  <w:vAlign w:val="center"/>
+                  <w:hideMark/>
+                </w:tcPr>
+                <w:p>
+                  <w:pPr>
+                    <w:spacing w:after="0" w:line="240" w:lineRule="auto"/>
+                    <w:rPr>
+                      <w:rFonts w:asciiTheme="minorHAnsi" w:eastAsia="Times New Roman" w:hAnsiTheme="minorHAnsi" w:cs="Times New Roman"/>
+                      <w:sz w:val="24"/>
+                      <w:szCs w:val="24"/>
+                      <w:lang w:val="en-AU" w:eastAsia="en-AU"/>
+                    </w:rPr>
+                  </w:pPr>
+                </w:p>
+              </w:tc>
+            </w:tr>
+          </w:tbl>
+          <w:p>
+            <w:pPr>
+              <w:rPr>
+                <w:rFonts w:asciiTheme="minorHAnsi" w:hAnsiTheme="minorHAnsi"/>
+              </w:rPr>
+            </w:pPr>
+          </w:p>
         </w:tc>
         <w:tc>
           <w:tcPr>
             <w:tcW w:w="2016" w:type="dxa"/>
           </w:tcPr>
-          <w:p/>
+          <w:p>
+            <w:pPr>
+              <w:rPr>
+                <w:rFonts w:asciiTheme="minorHAnsi" w:hAnsiTheme="minorHAnsi"/>
+              </w:rPr>
+            </w:pPr>
+            <w:r>
+              <w:rPr>
+                <w:rFonts w:asciiTheme="minorHAnsi" w:hAnsiTheme="minorHAnsi"/>
+              </w:rPr>
+              <w:t>Accepted</w:t>
+            </w:r>
+          </w:p>
         </w:tc>
         <w:tc>
           <w:tcPr>
             <w:tcW w:w="2016" w:type="dxa"/>
           </w:tcPr>
-          <w:p/>
+          <w:p>
+            <w:pPr>
+              <w:rPr>
+                <w:rFonts w:asciiTheme="minorHAnsi" w:hAnsiTheme="minorHAnsi"/>
+              </w:rPr>
+            </w:pPr>
+            <w:r>
+              <w:rPr>
+                <w:rFonts w:asciiTheme="minorHAnsi" w:hAnsiTheme="minorHAnsi"/>
+              </w:rPr>
+              <w:t>An enumeration only allows those three values, so a typo like "Canceled" can't be saved.</w:t>
+            </w:r>
+          </w:p>
         </w:tc>
         <w:tc>
           <w:tcPr>
             <w:tcW w:w="2016" w:type="dxa"/>
           </w:tcPr>
-          <w:p/>
+          <w:p>
+            <w:pPr>
+              <w:rPr>
+                <w:rFonts w:asciiTheme="minorHAnsi" w:hAnsiTheme="minorHAnsi"/>
+              </w:rPr>
+            </w:pPr>
+            <w:r>
+              <w:rPr>
+                <w:rFonts w:asciiTheme="minorHAnsi" w:hAnsiTheme="minorHAnsi"/>
+              </w:rPr>
+              <w:t xml:space="preserve">Changed status: str to status: </w:t>
+            </w:r>
+            <w:proofErr w:type="spellStart"/>
+            <w:r>
+              <w:rPr>
+                <w:rFonts w:asciiTheme="minorHAnsi" w:hAnsiTheme="minorHAnsi"/>
+              </w:rPr>
+              <w:t>AppointmentStatus</w:t>
+            </w:r>
+            <w:proofErr w:type="spellEnd"/>
+            <w:r>
+              <w:rPr>
+                <w:rFonts w:asciiTheme="minorHAnsi" w:hAnsiTheme="minorHAnsi"/>
+              </w:rPr>
+              <w:t xml:space="preserve"> and added an «enumeration» box</w:t>
+            </w:r>
+          </w:p>
         </w:tc>
       </w:tr>
       <w:tr>
@@ -1426,31 +1659,105 @@
           <w:tcPr>
             <w:tcW w:w="2016" w:type="dxa"/>
           </w:tcPr>
-          <w:p/>
+          <w:p>
+            <w:pPr>
+              <w:rPr>
+                <w:rFonts w:asciiTheme="minorHAnsi" w:hAnsiTheme="minorHAnsi"/>
+              </w:rPr>
+            </w:pPr>
+            <w:r>
+              <w:rPr>
+                <w:rFonts w:asciiTheme="minorHAnsi" w:hAnsiTheme="minorHAnsi"/>
+              </w:rPr>
+              <w:t>Practitioner has no attributes</w:t>
+            </w:r>
+          </w:p>
         </w:tc>
         <w:tc>
           <w:tcPr>
             <w:tcW w:w="2016" w:type="dxa"/>
           </w:tcPr>
-          <w:p/>
+          <w:p>
+            <w:pPr>
+              <w:rPr>
+                <w:rFonts w:asciiTheme="minorHAnsi" w:hAnsiTheme="minorHAnsi"/>
+              </w:rPr>
+            </w:pPr>
+            <w:r>
+              <w:rPr>
+                <w:rFonts w:asciiTheme="minorHAnsi" w:hAnsiTheme="minorHAnsi"/>
+              </w:rPr>
+              <w:t>FR-11 adds a practitioner and FR-12 lists them</w:t>
+            </w:r>
+          </w:p>
         </w:tc>
         <w:tc>
           <w:tcPr>
             <w:tcW w:w="2016" w:type="dxa"/>
           </w:tcPr>
-          <w:p/>
+          <w:p>
+            <w:pPr>
+              <w:rPr>
+                <w:rFonts w:asciiTheme="minorHAnsi" w:hAnsiTheme="minorHAnsi"/>
+              </w:rPr>
+            </w:pPr>
+            <w:r>
+              <w:rPr>
+                <w:rFonts w:asciiTheme="minorHAnsi" w:hAnsiTheme="minorHAnsi"/>
+              </w:rPr>
+              <w:t xml:space="preserve">Modified </w:t>
+            </w:r>
+          </w:p>
         </w:tc>
         <w:tc>
           <w:tcPr>
             <w:tcW w:w="2016" w:type="dxa"/>
           </w:tcPr>
-          <w:p/>
+          <w:p>
+            <w:pPr>
+              <w:rPr>
+                <w:rFonts w:asciiTheme="minorHAnsi" w:hAnsiTheme="minorHAnsi"/>
+              </w:rPr>
+            </w:pPr>
+            <w:r>
+              <w:rPr>
+                <w:rFonts w:asciiTheme="minorHAnsi" w:hAnsiTheme="minorHAnsi"/>
+              </w:rPr>
+              <w:t xml:space="preserve">FR-12 needs something to list, so Practitioner </w:t>
+            </w:r>
+            <w:proofErr w:type="gramStart"/>
+            <w:r>
+              <w:rPr>
+                <w:rFonts w:asciiTheme="minorHAnsi" w:hAnsiTheme="minorHAnsi"/>
+              </w:rPr>
+              <w:t>has to</w:t>
+            </w:r>
+            <w:proofErr w:type="gramEnd"/>
+            <w:r>
+              <w:rPr>
+                <w:rFonts w:asciiTheme="minorHAnsi" w:hAnsiTheme="minorHAnsi"/>
+              </w:rPr>
+              <w:t xml:space="preserve"> keep an id and a name.</w:t>
+            </w:r>
+          </w:p>
         </w:tc>
         <w:tc>
           <w:tcPr>
             <w:tcW w:w="2016" w:type="dxa"/>
           </w:tcPr>
-          <w:p/>
+          <w:p>
+            <w:pPr>
+              <w:rPr>
+                <w:rFonts w:asciiTheme="minorHAnsi" w:hAnsiTheme="minorHAnsi"/>
+              </w:rPr>
+            </w:pPr>
+            <w:r>
+              <w:rPr>
+                <w:rFonts w:asciiTheme="minorHAnsi" w:hAnsiTheme="minorHAnsi"/>
+              </w:rPr>
+              <w:t>Kept id and name, noted as assumptions (not stated in FR-11)</w:t>
+            </w:r>
+          </w:p>
         </w:tc>
       </w:tr>
       <w:tr>
@@ -1458,31 +1765,274 @@
           <w:tcPr>
             <w:tcW w:w="2016" w:type="dxa"/>
           </w:tcPr>
-          <w:p/>
+          <w:tbl>
+            <w:tblPr>
+              <w:tblW w:w="0" w:type="auto"/>
+              <w:tblCellSpacing w:w="15" w:type="dxa"/>
+              <w:tblCellMar>
+                <w:top w:w="15" w:type="dxa"/>
+                <w:left w:w="15" w:type="dxa"/>
+                <w:bottom w:w="15" w:type="dxa"/>
+                <w:right w:w="15" w:type="dxa"/>
+              </w:tblCellMar>
+              <w:tblLook w:val="04A0" w:firstRow="1" w:lastRow="0" w:firstColumn="1" w:lastColumn="0" w:noHBand="0" w:noVBand="1"/>
+            </w:tblPr>
+            <w:tblGrid>
+              <w:gridCol w:w="3571"/>
+              <w:gridCol w:w="80"/>
+            </w:tblGrid>
+            <w:tr>
+              <w:trPr>
+                <w:tblCellSpacing w:w="15" w:type="dxa"/>
+              </w:trPr>
+              <w:tc>
+                <w:tcPr>
+                  <w:tcW w:w="0" w:type="auto"/>
+                  <w:vAlign w:val="center"/>
+                  <w:hideMark/>
+                </w:tcPr>
+                <w:p>
+                  <w:pPr>
+                    <w:spacing w:after="0" w:line="240" w:lineRule="auto"/>
+                    <w:rPr>
+                      <w:rFonts w:asciiTheme="minorHAnsi" w:eastAsia="Times New Roman" w:hAnsiTheme="minorHAnsi" w:cs="Times New Roman"/>
+                      <w:sz w:val="24"/>
+                      <w:szCs w:val="24"/>
+                      <w:lang w:val="en-AU" w:eastAsia="en-AU"/>
+                    </w:rPr>
+                  </w:pPr>
+                  <w:proofErr w:type="spellStart"/>
+                  <w:r>
+                    <w:rPr>
+                      <w:rFonts w:asciiTheme="minorHAnsi" w:eastAsia="Times New Roman" w:hAnsiTheme="minorHAnsi" w:cs="Times New Roman"/>
+                      <w:sz w:val="24"/>
+                      <w:szCs w:val="24"/>
+                      <w:lang w:val="en-AU" w:eastAsia="en-AU"/>
+                    </w:rPr>
+                    <w:t>Practitioner.viewTodayAppointments</w:t>
+                  </w:r>
+                  <w:proofErr w:type="spellEnd"/>
+                  <w:r>
+                    <w:rPr>
+                      <w:rFonts w:asciiTheme="minorHAnsi" w:eastAsia="Times New Roman" w:hAnsiTheme="minorHAnsi" w:cs="Times New Roman"/>
+                      <w:sz w:val="24"/>
+                      <w:szCs w:val="24"/>
+                      <w:lang w:val="en-AU" w:eastAsia="en-AU"/>
+                    </w:rPr>
+                    <w:t>()</w:t>
+                  </w:r>
+                </w:p>
+              </w:tc>
+              <w:tc>
+                <w:tcPr>
+                  <w:tcW w:w="0" w:type="auto"/>
+                  <w:vAlign w:val="center"/>
+                  <w:hideMark/>
+                </w:tcPr>
+                <w:p>
+                  <w:pPr>
+                    <w:spacing w:after="0" w:line="240" w:lineRule="auto"/>
+                    <w:rPr>
+                      <w:rFonts w:asciiTheme="minorHAnsi" w:eastAsia="Times New Roman" w:hAnsiTheme="minorHAnsi" w:cs="Times New Roman"/>
+                      <w:sz w:val="24"/>
+                      <w:szCs w:val="24"/>
+                      <w:lang w:val="en-AU" w:eastAsia="en-AU"/>
+                    </w:rPr>
+                  </w:pPr>
+                </w:p>
+              </w:tc>
+            </w:tr>
+          </w:tbl>
+          <w:p>
+            <w:pPr>
+              <w:rPr>
+                <w:rFonts w:asciiTheme="minorHAnsi" w:hAnsiTheme="minorHAnsi"/>
+              </w:rPr>
+            </w:pPr>
+          </w:p>
         </w:tc>
         <w:tc>
           <w:tcPr>
             <w:tcW w:w="2016" w:type="dxa"/>
           </w:tcPr>
-          <w:p/>
+          <w:tbl>
+            <w:tblPr>
+              <w:tblW w:w="0" w:type="auto"/>
+              <w:tblCellSpacing w:w="15" w:type="dxa"/>
+              <w:tblCellMar>
+                <w:top w:w="15" w:type="dxa"/>
+                <w:left w:w="15" w:type="dxa"/>
+                <w:bottom w:w="15" w:type="dxa"/>
+                <w:right w:w="15" w:type="dxa"/>
+              </w:tblCellMar>
+              <w:tblLook w:val="04A0" w:firstRow="1" w:lastRow="0" w:firstColumn="1" w:lastColumn="0" w:noHBand="0" w:noVBand="1"/>
+            </w:tblPr>
+            <w:tblGrid>
+              <w:gridCol w:w="1306"/>
+              <w:gridCol w:w="80"/>
+            </w:tblGrid>
+            <w:tr>
+              <w:trPr>
+                <w:tblCellSpacing w:w="15" w:type="dxa"/>
+              </w:trPr>
+              <w:tc>
+                <w:tcPr>
+                  <w:tcW w:w="0" w:type="auto"/>
+                  <w:vAlign w:val="center"/>
+                  <w:hideMark/>
+                </w:tcPr>
+                <w:p>
+                  <w:pPr>
+                    <w:spacing w:after="0" w:line="240" w:lineRule="auto"/>
+                    <w:rPr>
+                      <w:rFonts w:asciiTheme="minorHAnsi" w:eastAsia="Times New Roman" w:hAnsiTheme="minorHAnsi" w:cs="Times New Roman"/>
+                      <w:sz w:val="24"/>
+                      <w:szCs w:val="24"/>
+                      <w:lang w:val="en-AU" w:eastAsia="en-AU"/>
+                    </w:rPr>
+                  </w:pPr>
+                  <w:r>
+                    <w:rPr>
+                      <w:rFonts w:asciiTheme="minorHAnsi" w:eastAsia="Times New Roman" w:hAnsiTheme="minorHAnsi" w:cs="Times New Roman"/>
+                      <w:sz w:val="24"/>
+                      <w:szCs w:val="24"/>
+                      <w:lang w:val="en-AU" w:eastAsia="en-AU"/>
+                    </w:rPr>
+                    <w:t>FR-09 and FR-10 need a practitioner's appointments</w:t>
+                  </w:r>
+                </w:p>
+              </w:tc>
+              <w:tc>
+                <w:tcPr>
+                  <w:tcW w:w="0" w:type="auto"/>
+                  <w:vAlign w:val="center"/>
+                  <w:hideMark/>
+                </w:tcPr>
+                <w:p>
+                  <w:pPr>
+                    <w:spacing w:after="0" w:line="240" w:lineRule="auto"/>
+                    <w:rPr>
+                      <w:rFonts w:asciiTheme="minorHAnsi" w:eastAsia="Times New Roman" w:hAnsiTheme="minorHAnsi" w:cs="Times New Roman"/>
+                      <w:sz w:val="24"/>
+                      <w:szCs w:val="24"/>
+                      <w:lang w:val="en-AU" w:eastAsia="en-AU"/>
+                    </w:rPr>
+                  </w:pPr>
+                </w:p>
+              </w:tc>
+            </w:tr>
+          </w:tbl>
+          <w:p>
+            <w:pPr>
+              <w:rPr>
+                <w:rFonts w:asciiTheme="minorHAnsi" w:hAnsiTheme="minorHAnsi"/>
+              </w:rPr>
+            </w:pPr>
+          </w:p>
         </w:tc>
         <w:tc>
           <w:tcPr>
             <w:tcW w:w="2016" w:type="dxa"/>
           </w:tcPr>
-          <w:p/>
+          <w:p>
+            <w:pPr>
+              <w:rPr>
+                <w:rFonts w:asciiTheme="minorHAnsi" w:hAnsiTheme="minorHAnsi"/>
+              </w:rPr>
+            </w:pPr>
+            <w:r>
+              <w:rPr>
+                <w:rFonts w:asciiTheme="minorHAnsi" w:hAnsiTheme="minorHAnsi"/>
+              </w:rPr>
+              <w:t>Rejected</w:t>
+            </w:r>
+          </w:p>
         </w:tc>
         <w:tc>
           <w:tcPr>
             <w:tcW w:w="2016" w:type="dxa"/>
           </w:tcPr>
-          <w:p/>
+          <w:p>
+            <w:pPr>
+              <w:rPr>
+                <w:rFonts w:asciiTheme="minorHAnsi" w:hAnsiTheme="minorHAnsi"/>
+              </w:rPr>
+            </w:pPr>
+            <w:r>
+              <w:rPr>
+                <w:rFonts w:asciiTheme="minorHAnsi" w:hAnsiTheme="minorHAnsi"/>
+              </w:rPr>
+              <w:t xml:space="preserve">One Practitioner can't see all the appointments, but </w:t>
+            </w:r>
+            <w:proofErr w:type="spellStart"/>
+            <w:r>
+              <w:rPr>
+                <w:rFonts w:asciiTheme="minorHAnsi" w:hAnsiTheme="minorHAnsi"/>
+              </w:rPr>
+              <w:t>AppointmentManager</w:t>
+            </w:r>
+            <w:proofErr w:type="spellEnd"/>
+            <w:r>
+              <w:rPr>
+                <w:rFonts w:asciiTheme="minorHAnsi" w:hAnsiTheme="minorHAnsi"/>
+              </w:rPr>
+              <w:t xml:space="preserve"> holds the full list.</w:t>
+            </w:r>
+          </w:p>
         </w:tc>
         <w:tc>
           <w:tcPr>
             <w:tcW w:w="2016" w:type="dxa"/>
           </w:tcPr>
-          <w:p/>
+          <w:p>
+            <w:pPr>
+              <w:rPr>
+                <w:rFonts w:asciiTheme="minorHAnsi" w:hAnsiTheme="minorHAnsi"/>
+              </w:rPr>
+            </w:pPr>
+            <w:r>
+              <w:rPr>
+                <w:rFonts w:asciiTheme="minorHAnsi" w:hAnsiTheme="minorHAnsi"/>
+              </w:rPr>
+              <w:t xml:space="preserve">None, </w:t>
+            </w:r>
+            <w:proofErr w:type="spellStart"/>
+            <w:r>
+              <w:rPr>
+                <w:rFonts w:asciiTheme="minorHAnsi" w:hAnsiTheme="minorHAnsi"/>
+              </w:rPr>
+              <w:t>get_</w:t>
+            </w:r>
+            <w:proofErr w:type="gramStart"/>
+            <w:r>
+              <w:rPr>
+                <w:rFonts w:asciiTheme="minorHAnsi" w:hAnsiTheme="minorHAnsi"/>
+              </w:rPr>
+              <w:t>schedule</w:t>
+            </w:r>
+            <w:proofErr w:type="spellEnd"/>
+            <w:r>
+              <w:rPr>
+                <w:rFonts w:asciiTheme="minorHAnsi" w:hAnsiTheme="minorHAnsi"/>
+              </w:rPr>
+              <w:t>(</w:t>
+            </w:r>
+            <w:proofErr w:type="gramEnd"/>
+            <w:r>
+              <w:rPr>
+                <w:rFonts w:asciiTheme="minorHAnsi" w:hAnsiTheme="minorHAnsi"/>
+              </w:rPr>
+              <w:t xml:space="preserve">) stays on </w:t>
+            </w:r>
+            <w:proofErr w:type="spellStart"/>
+            <w:r>
+              <w:rPr>
+                <w:rFonts w:asciiTheme="minorHAnsi" w:hAnsiTheme="minorHAnsi"/>
+              </w:rPr>
+              <w:t>AppointmentManager</w:t>
+            </w:r>
+            <w:proofErr w:type="spellEnd"/>
+          </w:p>
         </w:tc>
       </w:tr>
       <w:tr>
@@ -1490,31 +2040,185 @@
           <w:tcPr>
             <w:tcW w:w="2016" w:type="dxa"/>
           </w:tcPr>
-          <w:p/>
+          <w:p>
+            <w:pPr>
+              <w:rPr>
+                <w:rFonts w:asciiTheme="minorHAnsi" w:hAnsiTheme="minorHAnsi"/>
+              </w:rPr>
+            </w:pPr>
+            <w:r>
+              <w:rPr>
+                <w:rFonts w:asciiTheme="minorHAnsi" w:hAnsiTheme="minorHAnsi"/>
+              </w:rPr>
+              <w:t xml:space="preserve">Split update into </w:t>
+            </w:r>
+            <w:proofErr w:type="spellStart"/>
+            <w:proofErr w:type="gramStart"/>
+            <w:r>
+              <w:rPr>
+                <w:rFonts w:asciiTheme="minorHAnsi" w:hAnsiTheme="minorHAnsi"/>
+              </w:rPr>
+              <w:t>updatePhoneNumber</w:t>
+            </w:r>
+            <w:proofErr w:type="spellEnd"/>
+            <w:r>
+              <w:rPr>
+                <w:rFonts w:asciiTheme="minorHAnsi" w:hAnsiTheme="minorHAnsi"/>
+              </w:rPr>
+              <w:t>(</w:t>
+            </w:r>
+            <w:proofErr w:type="gramEnd"/>
+            <w:r>
+              <w:rPr>
+                <w:rFonts w:asciiTheme="minorHAnsi" w:hAnsiTheme="minorHAnsi"/>
+              </w:rPr>
+              <w:t xml:space="preserve">) / </w:t>
+            </w:r>
+            <w:proofErr w:type="spellStart"/>
+            <w:proofErr w:type="gramStart"/>
+            <w:r>
+              <w:rPr>
+                <w:rFonts w:asciiTheme="minorHAnsi" w:hAnsiTheme="minorHAnsi"/>
+              </w:rPr>
+              <w:t>updateAddress</w:t>
+            </w:r>
+            <w:proofErr w:type="spellEnd"/>
+            <w:r>
+              <w:rPr>
+                <w:rFonts w:asciiTheme="minorHAnsi" w:hAnsiTheme="minorHAnsi"/>
+              </w:rPr>
+              <w:t>(</w:t>
+            </w:r>
+            <w:proofErr w:type="gramEnd"/>
+            <w:r>
+              <w:rPr>
+                <w:rFonts w:asciiTheme="minorHAnsi" w:hAnsiTheme="minorHAnsi"/>
+              </w:rPr>
+              <w:t>)</w:t>
+            </w:r>
+          </w:p>
         </w:tc>
         <w:tc>
           <w:tcPr>
             <w:tcW w:w="2016" w:type="dxa"/>
           </w:tcPr>
-          <w:p/>
+          <w:p>
+            <w:pPr>
+              <w:rPr>
+                <w:rFonts w:asciiTheme="minorHAnsi" w:hAnsiTheme="minorHAnsi"/>
+              </w:rPr>
+            </w:pPr>
+            <w:r>
+              <w:rPr>
+                <w:rFonts w:asciiTheme="minorHAnsi" w:hAnsiTheme="minorHAnsi"/>
+              </w:rPr>
+              <w:t>FR-07 says update phone or address</w:t>
+            </w:r>
+          </w:p>
         </w:tc>
         <w:tc>
           <w:tcPr>
             <w:tcW w:w="2016" w:type="dxa"/>
           </w:tcPr>
-          <w:p/>
+          <w:p>
+            <w:pPr>
+              <w:rPr>
+                <w:rFonts w:asciiTheme="minorHAnsi" w:hAnsiTheme="minorHAnsi"/>
+              </w:rPr>
+            </w:pPr>
+            <w:r>
+              <w:rPr>
+                <w:rFonts w:asciiTheme="minorHAnsi" w:hAnsiTheme="minorHAnsi"/>
+              </w:rPr>
+              <w:t>Rejected</w:t>
+            </w:r>
+          </w:p>
         </w:tc>
         <w:tc>
           <w:tcPr>
             <w:tcW w:w="2016" w:type="dxa"/>
           </w:tcPr>
-          <w:p/>
+          <w:p>
+            <w:pPr>
+              <w:rPr>
+                <w:rFonts w:asciiTheme="minorHAnsi" w:hAnsiTheme="minorHAnsi"/>
+              </w:rPr>
+            </w:pPr>
+            <w:r>
+              <w:rPr>
+                <w:rFonts w:asciiTheme="minorHAnsi" w:hAnsiTheme="minorHAnsi"/>
+              </w:rPr>
+              <w:t xml:space="preserve">A single method already covers </w:t>
+            </w:r>
+            <w:proofErr w:type="gramStart"/>
+            <w:r>
+              <w:rPr>
+                <w:rFonts w:asciiTheme="minorHAnsi" w:hAnsiTheme="minorHAnsi"/>
+              </w:rPr>
+              <w:t>both, and</w:t>
+            </w:r>
+            <w:proofErr w:type="gramEnd"/>
+            <w:r>
+              <w:rPr>
+                <w:rFonts w:asciiTheme="minorHAnsi" w:hAnsiTheme="minorHAnsi"/>
+              </w:rPr>
+              <w:t xml:space="preserve"> splitting it adds methods without meeting any extra </w:t>
+            </w:r>
+            <w:r>
+              <w:rPr>
+                <w:rFonts w:asciiTheme="minorHAnsi" w:hAnsiTheme="minorHAnsi"/>
+              </w:rPr>
+              <w:lastRenderedPageBreak/>
+              <w:t>requirement.</w:t>
+            </w:r>
+          </w:p>
         </w:tc>
         <w:tc>
           <w:tcPr>
             <w:tcW w:w="2016" w:type="dxa"/>
           </w:tcPr>
-          <w:p/>
+          <w:p>
+            <w:pPr>
+              <w:rPr>
+                <w:rFonts w:asciiTheme="minorHAnsi" w:hAnsiTheme="minorHAnsi"/>
+              </w:rPr>
+            </w:pPr>
+            <w:r>
+              <w:rPr>
+                <w:rFonts w:asciiTheme="minorHAnsi" w:hAnsiTheme="minorHAnsi"/>
+              </w:rPr>
+              <w:lastRenderedPageBreak/>
+              <w:t xml:space="preserve">None, kept </w:t>
+            </w:r>
+            <w:proofErr w:type="spellStart"/>
+            <w:r>
+              <w:rPr>
+                <w:rFonts w:asciiTheme="minorHAnsi" w:hAnsiTheme="minorHAnsi"/>
+              </w:rPr>
+              <w:t>update_</w:t>
+            </w:r>
+            <w:proofErr w:type="gramStart"/>
+            <w:r>
+              <w:rPr>
+                <w:rFonts w:asciiTheme="minorHAnsi" w:hAnsiTheme="minorHAnsi"/>
+              </w:rPr>
+              <w:t>contact</w:t>
+            </w:r>
+            <w:proofErr w:type="spellEnd"/>
+            <w:r>
+              <w:rPr>
+                <w:rFonts w:asciiTheme="minorHAnsi" w:hAnsiTheme="minorHAnsi"/>
+              </w:rPr>
+              <w:t>(</w:t>
+            </w:r>
+            <w:proofErr w:type="gramEnd"/>
+            <w:r>
+              <w:rPr>
+                <w:rFonts w:asciiTheme="minorHAnsi" w:hAnsiTheme="minorHAnsi"/>
+              </w:rPr>
+              <w:t>phone, address)</w:t>
+            </w:r>
+          </w:p>
         </w:tc>
       </w:tr>
     </w:tbl>

</xml_diff>